<commit_message>
TACL: compact figures (cap 2.0in height) + tighter float spacing -> ~11 content pages
Layout/image optimization to reclaim space without cutting content: body charts scaled from
~5.7x3.3in to ~3.6x2.0in (finalize_tacl figure cap), plus tighter equation/table spacing in
the tacl profile. Reclaimed ~0.4 page. Content is genuinely ~11-11.5 pages (page 11 is 96%
full; Limitations/Ethics/Reproducibility spill before References).

Co-Authored-By: Claude Opus 4.8 <noreply@anthropic.com>
</commit_message>
<xml_diff>
--- a/docs/paper/CoEval_TACL.docx
+++ b/docs/paper/CoEval_TACL.docx
@@ -4419,7 +4419,7 @@
     <w:p>
       <w:pPr>
         <w:pStyle w:val="TableCaption"/>
-        <w:spacing w:before="240" w:after="60" w:line="240" w:lineRule="auto"/>
+        <w:spacing w:before="160" w:after="60" w:line="240" w:lineRule="auto"/>
         <w:jc w:val="center"/>
         <w:keepNext/>
         <w:keepLines/>
@@ -5612,7 +5612,7 @@
       <w:r>
         <w:drawing>
           <wp:inline>
-            <wp:extent cx="5224272" cy="2987040"/>
+            <wp:extent cx="3198533" cy="1828800"/>
             <wp:effectExtent b="0" l="0" r="0" t="0"/>
             <wp:docPr descr="CoEval ensemble score versus ground-truth accuracy per model; rankings identical" title="" id="22" name="Picture"/>
             <a:graphic>
@@ -5633,7 +5633,7 @@
                   <pic:spPr bwMode="auto">
                     <a:xfrm>
                       <a:off x="0" y="0"/>
-                      <a:ext cx="5224272" cy="2987040"/>
+                      <a:ext cx="3198533" cy="1828800"/>
                     </a:xfrm>
                     <a:prstGeom prst="rect">
                       <a:avLst/>
@@ -5686,7 +5686,7 @@
     <w:p>
       <w:pPr>
         <w:pStyle w:val="TableCaption"/>
-        <w:spacing w:before="240" w:after="60" w:line="240" w:lineRule="auto"/>
+        <w:spacing w:before="160" w:after="60" w:line="240" w:lineRule="auto"/>
         <w:jc w:val="center"/>
         <w:keepNext/>
         <w:keepLines/>
@@ -7875,7 +7875,7 @@
       <w:r>
         <w:drawing>
           <wp:inline>
-            <wp:extent cx="4815840" cy="3169920"/>
+            <wp:extent cx="2778369" cy="1828799"/>
             <wp:effectExtent b="0" l="0" r="0" t="0"/>
             <wp:docPr descr="ICC(3,k) versus number of judges, peaking at the selected strong panel" title="" id="26" name="Picture"/>
             <a:graphic>
@@ -7896,7 +7896,7 @@
                   <pic:spPr bwMode="auto">
                     <a:xfrm>
                       <a:off x="0" y="0"/>
-                      <a:ext cx="4815840" cy="3169920"/>
+                      <a:ext cx="2778369" cy="1828799"/>
                     </a:xfrm>
                     <a:prstGeom prst="rect">
                       <a:avLst/>
@@ -8961,7 +8961,7 @@
     <w:p>
       <w:pPr>
         <w:pStyle w:val="TableCaption"/>
-        <w:spacing w:before="240" w:after="60" w:line="240" w:lineRule="auto"/>
+        <w:spacing w:before="160" w:after="60" w:line="240" w:lineRule="auto"/>
         <w:jc w:val="center"/>
         <w:keepNext/>
         <w:keepLines/>
@@ -10924,7 +10924,7 @@
     <w:p>
       <w:pPr>
         <w:pStyle w:val="TableCaption"/>
-        <w:spacing w:before="240" w:after="60" w:line="240" w:lineRule="auto"/>
+        <w:spacing w:before="160" w:after="60" w:line="240" w:lineRule="auto"/>
         <w:jc w:val="center"/>
         <w:keepNext/>
         <w:keepLines/>
@@ -15613,7 +15613,7 @@
       <w:r>
         <w:drawing>
           <wp:inline>
-            <wp:extent cx="2766974" cy="2411178"/>
+            <wp:extent cx="2098659" cy="1828800"/>
             <wp:effectExtent b="0" l="0" r="0" t="0"/>
             <wp:docPr descr="Heatmap of pairwise semantic similarity between auto-generated rubric criteria" title="" id="116" name="Picture"/>
             <a:graphic>
@@ -15634,7 +15634,7 @@
                   <pic:spPr bwMode="auto">
                     <a:xfrm>
                       <a:off x="0" y="0"/>
-                      <a:ext cx="2766974" cy="2411178"/>
+                      <a:ext cx="2098659" cy="1828800"/>
                     </a:xfrm>
                     <a:prstGeom prst="rect">
                       <a:avLst/>
@@ -16201,7 +16201,7 @@
     <w:p>
       <w:pPr>
         <w:pStyle w:val="TableCaption"/>
-        <w:spacing w:before="240" w:after="60" w:line="240" w:lineRule="auto"/>
+        <w:spacing w:before="160" w:after="60" w:line="240" w:lineRule="auto"/>
         <w:jc w:val="center"/>
         <w:keepNext/>
         <w:keepLines/>
@@ -17599,7 +17599,7 @@
     <w:p>
       <w:pPr>
         <w:pStyle w:val="TableCaption"/>
-        <w:spacing w:before="240" w:after="60" w:line="240" w:lineRule="auto"/>
+        <w:spacing w:before="160" w:after="60" w:line="240" w:lineRule="auto"/>
         <w:jc w:val="center"/>
         <w:keepNext/>
         <w:keepLines/>
@@ -19208,7 +19208,7 @@
     <w:p>
       <w:pPr>
         <w:pStyle w:val="TableCaption"/>
-        <w:spacing w:before="240" w:after="60" w:line="240" w:lineRule="auto"/>
+        <w:spacing w:before="160" w:after="60" w:line="240" w:lineRule="auto"/>
         <w:jc w:val="center"/>
         <w:keepNext/>
         <w:keepLines/>
@@ -20096,7 +20096,7 @@
       <w:r>
         <w:drawing>
           <wp:inline>
-            <wp:extent cx="5969000" cy="1928377"/>
+            <wp:extent cx="5660774" cy="1828800"/>
             <wp:effectExtent b="0" l="0" r="0" t="0"/>
             <wp:docPr descr="CoEval five-phase pipeline with teacher, student, and judge role bands" title="" id="123" name="Picture"/>
             <a:graphic>
@@ -20117,7 +20117,7 @@
                   <pic:spPr bwMode="auto">
                     <a:xfrm>
                       <a:off x="0" y="0"/>
-                      <a:ext cx="5969000" cy="1928377"/>
+                      <a:ext cx="5660774" cy="1828800"/>
                     </a:xfrm>
                     <a:prstGeom prst="rect">
                       <a:avLst/>
@@ -20170,7 +20170,7 @@
     <w:p>
       <w:pPr>
         <w:pStyle w:val="TableCaption"/>
-        <w:spacing w:before="240" w:after="60" w:line="240" w:lineRule="auto"/>
+        <w:spacing w:before="160" w:after="60" w:line="240" w:lineRule="auto"/>
         <w:jc w:val="center"/>
         <w:keepNext/>
         <w:keepLines/>
@@ -33839,7 +33839,7 @@
     <w:basedOn w:val="BodyText"/>
     <w:pPr>
       <w:keepNext/>
-      <w:spacing w:after="60" w:before="240" w:line="240" w:lineRule="auto"/>
+      <w:spacing w:after="60" w:before="160" w:line="240" w:lineRule="auto"/>
       <w:jc w:val="center"/>
     </w:pPr>
     <w:rPr>

</xml_diff>

<commit_message>
TACL: fix two-column line numbers (smaller font + fit gutter, no overlap)
Right-column line numbers were crammed into the 0.6cm gutter and crossing into the left
column because the line-number distance (284 twips ~0.2in) overflowed the gutter and the
numbers inherited a body-sized font. Fixes:
- distance 284 -> 130 twips (~0.09in) so the right-column numbers fit inside the gutter;
- 'Line Number' style font set to 8pt Times so they read as small margin marks.
Re-rendered: numbers present in BOTH columns (ACL convention), legible, no text overlap.

Co-Authored-By: Claude Opus 4.8 <noreply@anthropic.com>
</commit_message>
<xml_diff>
--- a/docs/paper/CoEval_TACL.docx
+++ b/docs/paper/CoEval_TACL.docx
@@ -368,7 +368,7 @@
           <w:type w:val="continuous"/>
           <w:pgSz w:h="16838" w:w="11906"/>
           <w:pgMar w:bottom="1417" w:footer="720" w:gutter="0" w:header="720" w:left="1417" w:right="1417" w:top="1417"/>
-          <w:lnNumType w:countBy="1" w:restart="continuous" w:distance="284"/>
+          <w:lnNumType w:countBy="1" w:restart="continuous" w:distance="130"/>
           <w:cols w:num="1" w:space="340"/>
           <w:docGrid w:linePitch="360"/>
         </w:sectPr>
@@ -4166,7 +4166,7 @@
           <w:type w:val="continuous"/>
           <w:pgSz w:h="16838" w:w="11906"/>
           <w:pgMar w:bottom="1417" w:footer="720" w:gutter="0" w:header="720" w:left="1417" w:right="1417" w:top="1417"/>
-          <w:lnNumType w:countBy="1" w:restart="continuous" w:distance="284"/>
+          <w:lnNumType w:countBy="1" w:restart="continuous" w:distance="130"/>
           <w:cols w:num="2" w:space="340" w:equalWidth="1"/>
           <w:docGrid w:linePitch="360"/>
         </w:sectPr>
@@ -4845,7 +4845,7 @@
           <w:type w:val="continuous"/>
           <w:pgSz w:h="16838" w:w="11906"/>
           <w:pgMar w:bottom="1417" w:footer="720" w:gutter="0" w:header="720" w:left="1417" w:right="1417" w:top="1417"/>
-          <w:lnNumType w:countBy="1" w:restart="continuous" w:distance="284"/>
+          <w:lnNumType w:countBy="1" w:restart="continuous" w:distance="130"/>
           <w:cols w:num="1" w:space="340"/>
           <w:docGrid w:linePitch="360"/>
         </w:sectPr>
@@ -5351,7 +5351,7 @@
           <w:type w:val="continuous"/>
           <w:pgSz w:h="16838" w:w="11906"/>
           <w:pgMar w:bottom="1417" w:footer="720" w:gutter="0" w:header="720" w:left="1417" w:right="1417" w:top="1417"/>
-          <w:lnNumType w:countBy="1" w:restart="continuous" w:distance="284"/>
+          <w:lnNumType w:countBy="1" w:restart="continuous" w:distance="130"/>
           <w:cols w:num="2" w:space="340" w:equalWidth="1"/>
           <w:docGrid w:linePitch="360"/>
         </w:sectPr>
@@ -5867,7 +5867,7 @@
           <w:type w:val="continuous"/>
           <w:pgSz w:h="16838" w:w="11906"/>
           <w:pgMar w:bottom="1417" w:footer="720" w:gutter="0" w:header="720" w:left="1417" w:right="1417" w:top="1417"/>
-          <w:lnNumType w:countBy="1" w:restart="continuous" w:distance="284"/>
+          <w:lnNumType w:countBy="1" w:restart="continuous" w:distance="130"/>
           <w:cols w:num="1" w:space="340"/>
           <w:docGrid w:linePitch="360"/>
         </w:sectPr>
@@ -6257,7 +6257,7 @@
           <w:type w:val="continuous"/>
           <w:pgSz w:h="16838" w:w="11906"/>
           <w:pgMar w:bottom="1417" w:footer="720" w:gutter="0" w:header="720" w:left="1417" w:right="1417" w:top="1417"/>
-          <w:lnNumType w:countBy="1" w:restart="continuous" w:distance="284"/>
+          <w:lnNumType w:countBy="1" w:restart="continuous" w:distance="130"/>
           <w:cols w:num="2" w:space="340" w:equalWidth="1"/>
           <w:docGrid w:linePitch="360"/>
         </w:sectPr>
@@ -7003,7 +7003,7 @@
           <w:type w:val="continuous"/>
           <w:pgSz w:h="16838" w:w="11906"/>
           <w:pgMar w:bottom="1417" w:footer="720" w:gutter="0" w:header="720" w:left="1417" w:right="1417" w:top="1417"/>
-          <w:lnNumType w:countBy="1" w:restart="continuous" w:distance="284"/>
+          <w:lnNumType w:countBy="1" w:restart="continuous" w:distance="130"/>
           <w:cols w:num="1" w:space="340"/>
           <w:docGrid w:linePitch="360"/>
         </w:sectPr>
@@ -7614,7 +7614,7 @@
           <w:type w:val="continuous"/>
           <w:pgSz w:h="16838" w:w="11906"/>
           <w:pgMar w:bottom="1417" w:footer="720" w:gutter="0" w:header="720" w:left="1417" w:right="1417" w:top="1417"/>
-          <w:lnNumType w:countBy="1" w:restart="continuous" w:distance="284"/>
+          <w:lnNumType w:countBy="1" w:restart="continuous" w:distance="130"/>
           <w:cols w:num="2" w:space="340" w:equalWidth="1"/>
           <w:docGrid w:linePitch="360"/>
         </w:sectPr>
@@ -7723,7 +7723,7 @@
           <w:type w:val="continuous"/>
           <w:pgSz w:h="16838" w:w="11906"/>
           <w:pgMar w:bottom="1417" w:footer="720" w:gutter="0" w:header="720" w:left="1417" w:right="1417" w:top="1417"/>
-          <w:lnNumType w:countBy="1" w:restart="continuous" w:distance="284"/>
+          <w:lnNumType w:countBy="1" w:restart="continuous" w:distance="130"/>
           <w:cols w:num="1" w:space="340"/>
           <w:docGrid w:linePitch="360"/>
         </w:sectPr>
@@ -8708,7 +8708,7 @@
           <w:type w:val="continuous"/>
           <w:pgSz w:h="16838" w:w="11906"/>
           <w:pgMar w:bottom="1417" w:footer="720" w:gutter="0" w:header="720" w:left="1417" w:right="1417" w:top="1417"/>
-          <w:lnNumType w:countBy="1" w:restart="continuous" w:distance="284"/>
+          <w:lnNumType w:countBy="1" w:restart="continuous" w:distance="130"/>
           <w:cols w:num="2" w:space="340" w:equalWidth="1"/>
           <w:docGrid w:linePitch="360"/>
         </w:sectPr>
@@ -9572,7 +9572,7 @@
           <w:type w:val="continuous"/>
           <w:pgSz w:h="16838" w:w="11906"/>
           <w:pgMar w:bottom="1417" w:footer="720" w:gutter="0" w:header="720" w:left="1417" w:right="1417" w:top="1417"/>
-          <w:lnNumType w:countBy="1" w:restart="continuous" w:distance="284"/>
+          <w:lnNumType w:countBy="1" w:restart="continuous" w:distance="130"/>
           <w:cols w:num="1" w:space="340"/>
           <w:docGrid w:linePitch="360"/>
         </w:sectPr>
@@ -10671,7 +10671,7 @@
           <w:type w:val="continuous"/>
           <w:pgSz w:h="16838" w:w="11906"/>
           <w:pgMar w:bottom="1417" w:footer="720" w:gutter="0" w:header="720" w:left="1417" w:right="1417" w:top="1417"/>
-          <w:lnNumType w:countBy="1" w:restart="continuous" w:distance="284"/>
+          <w:lnNumType w:countBy="1" w:restart="continuous" w:distance="130"/>
           <w:cols w:num="2" w:space="340" w:equalWidth="1"/>
           <w:docGrid w:linePitch="360"/>
         </w:sectPr>
@@ -11585,7 +11585,7 @@
           <w:type w:val="continuous"/>
           <w:pgSz w:h="16838" w:w="11906"/>
           <w:pgMar w:bottom="1417" w:footer="720" w:gutter="0" w:header="720" w:left="1417" w:right="1417" w:top="1417"/>
-          <w:lnNumType w:countBy="1" w:restart="continuous" w:distance="284"/>
+          <w:lnNumType w:countBy="1" w:restart="continuous" w:distance="130"/>
           <w:cols w:num="1" w:space="340"/>
           <w:docGrid w:linePitch="360"/>
         </w:sectPr>
@@ -15948,7 +15948,7 @@
           <w:type w:val="continuous"/>
           <w:pgSz w:h="16838" w:w="11906"/>
           <w:pgMar w:bottom="1417" w:footer="720" w:gutter="0" w:header="720" w:left="1417" w:right="1417" w:top="1417"/>
-          <w:lnNumType w:countBy="1" w:restart="continuous" w:distance="284"/>
+          <w:lnNumType w:countBy="1" w:restart="continuous" w:distance="130"/>
           <w:cols w:num="2" w:space="340" w:equalWidth="1"/>
           <w:docGrid w:linePitch="360"/>
         </w:sectPr>
@@ -16450,7 +16450,7 @@
           <w:type w:val="continuous"/>
           <w:pgSz w:h="16838" w:w="11906"/>
           <w:pgMar w:bottom="1417" w:footer="720" w:gutter="0" w:header="720" w:left="1417" w:right="1417" w:top="1417"/>
-          <w:lnNumType w:countBy="1" w:restart="continuous" w:distance="284"/>
+          <w:lnNumType w:countBy="1" w:restart="continuous" w:distance="130"/>
           <w:cols w:num="1" w:space="340"/>
           <w:docGrid w:linePitch="360"/>
         </w:sectPr>
@@ -17346,7 +17346,7 @@
           <w:type w:val="continuous"/>
           <w:pgSz w:h="16838" w:w="11906"/>
           <w:pgMar w:bottom="1417" w:footer="720" w:gutter="0" w:header="720" w:left="1417" w:right="1417" w:top="1417"/>
-          <w:lnNumType w:countBy="1" w:restart="continuous" w:distance="284"/>
+          <w:lnNumType w:countBy="1" w:restart="continuous" w:distance="130"/>
           <w:cols w:num="2" w:space="340" w:equalWidth="1"/>
           <w:docGrid w:linePitch="360"/>
         </w:sectPr>
@@ -18641,7 +18641,7 @@
           <w:type w:val="continuous"/>
           <w:pgSz w:h="16838" w:w="11906"/>
           <w:pgMar w:bottom="1417" w:footer="720" w:gutter="0" w:header="720" w:left="1417" w:right="1417" w:top="1417"/>
-          <w:lnNumType w:countBy="1" w:restart="continuous" w:distance="284"/>
+          <w:lnNumType w:countBy="1" w:restart="continuous" w:distance="130"/>
           <w:cols w:num="1" w:space="340"/>
           <w:docGrid w:linePitch="360"/>
         </w:sectPr>
@@ -18955,7 +18955,7 @@
           <w:type w:val="continuous"/>
           <w:pgSz w:h="16838" w:w="11906"/>
           <w:pgMar w:bottom="1417" w:footer="720" w:gutter="0" w:header="720" w:left="1417" w:right="1417" w:top="1417"/>
-          <w:lnNumType w:countBy="1" w:restart="continuous" w:distance="284"/>
+          <w:lnNumType w:countBy="1" w:restart="continuous" w:distance="130"/>
           <w:cols w:num="2" w:space="340" w:equalWidth="1"/>
           <w:docGrid w:linePitch="360"/>
         </w:sectPr>
@@ -19519,7 +19519,7 @@
           <w:type w:val="continuous"/>
           <w:pgSz w:h="16838" w:w="11906"/>
           <w:pgMar w:bottom="1417" w:footer="720" w:gutter="0" w:header="720" w:left="1417" w:right="1417" w:top="1417"/>
-          <w:lnNumType w:countBy="1" w:restart="continuous" w:distance="284"/>
+          <w:lnNumType w:countBy="1" w:restart="continuous" w:distance="130"/>
           <w:cols w:num="1" w:space="340"/>
           <w:docGrid w:linePitch="360"/>
         </w:sectPr>
@@ -19835,7 +19835,7 @@
           <w:type w:val="continuous"/>
           <w:pgSz w:h="16838" w:w="11906"/>
           <w:pgMar w:bottom="1417" w:footer="720" w:gutter="0" w:header="720" w:left="1417" w:right="1417" w:top="1417"/>
-          <w:lnNumType w:countBy="1" w:restart="continuous" w:distance="284"/>
+          <w:lnNumType w:countBy="1" w:restart="continuous" w:distance="130"/>
           <w:cols w:num="2" w:space="340" w:equalWidth="1"/>
           <w:docGrid w:linePitch="360"/>
         </w:sectPr>
@@ -20679,7 +20679,7 @@
       <w:type w:val="continuous"/>
       <w:pgSz w:h="16838" w:w="11906"/>
       <w:pgMar w:bottom="1417" w:footer="720" w:gutter="0" w:header="720" w:left="1417" w:right="1417" w:top="1417"/>
-      <w:lnNumType w:countBy="1" w:restart="continuous" w:distance="284"/>
+      <w:lnNumType w:countBy="1" w:restart="continuous" w:distance="130"/>
       <w:cols w:num="1" w:space="340"/>
       <w:docGrid w:linePitch="360"/>
     </w:sectPr>
@@ -33869,6 +33869,13 @@
     <w:basedOn w:val="VerbatimChar"/>
     <w:rPr/>
   </w:style>
+  <w:style w:type="character" w:customStyle="1" w:styleId="LineNumber">
+    <w:name w:val="Line Number"/>
+    <w:rPr>
+      <w:rFonts w:ascii="Times New Roman" w:hAnsi="Times New Roman"/>
+      <w:sz w:val="16"/>
+    </w:rPr>
+  </w:style>
 </w:styles>
 </file>
 

</xml_diff>

<commit_message>
TACL: Figure 1 + Figure 2 now single-column (ACL norm), still 10 content pages
Body charts (correctness, ICC curve) flow in one column (3.0in wide) with text around them;
the architecture pipeline diagram still spans both columns. Render-verified on page 6.
Content pages stay at 10.
</commit_message>
<xml_diff>
--- a/docs/paper/CoEval_TACL.docx
+++ b/docs/paper/CoEval_TACL.docx
@@ -5332,33 +5332,6 @@
     </w:p>
     <w:p>
       <w:pPr>
-        <w:spacing w:before="0" w:after="0" w:line="440" w:lineRule="exact"/>
-        <w:rPr>
-          <w:sz w:val="2"/>
-          <w:szCs w:val="2"/>
-        </w:rPr>
-      </w:pPr>
-    </w:p>
-    <w:p>
-      <w:pPr>
-        <w:spacing w:before="0" w:after="0" w:line="20" w:lineRule="exact"/>
-        <w:rPr>
-          <w:sz w:val="2"/>
-          <w:szCs w:val="2"/>
-        </w:rPr>
-        <w:sectPr>
-          <w:headerReference w:type="default" r:id="rId13"/>
-          <w:type w:val="continuous"/>
-          <w:pgSz w:h="16838" w:w="11906"/>
-          <w:pgMar w:bottom="1417" w:footer="720" w:gutter="0" w:header="720" w:left="1417" w:right="1417" w:top="1417"/>
-          <w:lnNumType w:countBy="1" w:restart="continuous" w:distance="130"/>
-          <w:cols w:num="2" w:space="340" w:equalWidth="1"/>
-          <w:docGrid w:linePitch="360"/>
-        </w:sectPr>
-      </w:pPr>
-    </w:p>
-    <w:p>
-      <w:pPr>
         <w:pStyle w:val="BodyText"/>
         <w:jc w:val="center"/>
         <w:keepNext/>
@@ -5368,7 +5341,7 @@
       <w:r>
         <w:drawing>
           <wp:inline>
-            <wp:extent cx="3198533" cy="1828800"/>
+            <wp:extent cx="2766974" cy="1582050"/>
             <wp:effectExtent b="0" l="0" r="0" t="0"/>
             <wp:docPr descr="CoEval ensemble score versus ground-truth accuracy per model; rankings identical" title="" id="22" name="Picture"/>
             <a:graphic>
@@ -5389,7 +5362,7 @@
                   <pic:spPr bwMode="auto">
                     <a:xfrm>
                       <a:off x="0" y="0"/>
-                      <a:ext cx="3198533" cy="1828800"/>
+                      <a:ext cx="2766974" cy="1582050"/>
                     </a:xfrm>
                     <a:prstGeom prst="rect">
                       <a:avLst/>
@@ -5438,6 +5411,33 @@
         </w:rPr>
         <w:t>CoEval recovers the true model ranking with no labels. For each student model the CoEval frontier-ensemble accuracy score (green, datapoint-clustered 95% CI) and the held-out ground-truth accuracy (blue) coincide within 0.02, and the order gpt-4o-mini &gt; gpt-3.5-turbo &gt; llama-3.2-3b is reproduced exactly (cf. Table 2).</w:t>
       </w:r>
+    </w:p>
+    <w:p>
+      <w:pPr>
+        <w:spacing w:before="0" w:after="0" w:line="440" w:lineRule="exact"/>
+        <w:rPr>
+          <w:sz w:val="2"/>
+          <w:szCs w:val="2"/>
+        </w:rPr>
+      </w:pPr>
+    </w:p>
+    <w:p>
+      <w:pPr>
+        <w:spacing w:before="0" w:after="0" w:line="20" w:lineRule="exact"/>
+        <w:rPr>
+          <w:sz w:val="2"/>
+          <w:szCs w:val="2"/>
+        </w:rPr>
+        <w:sectPr>
+          <w:headerReference w:type="default" r:id="rId13"/>
+          <w:type w:val="continuous"/>
+          <w:pgSz w:h="16838" w:w="11906"/>
+          <w:pgMar w:bottom="1417" w:footer="720" w:gutter="0" w:header="720" w:left="1417" w:right="1417" w:top="1417"/>
+          <w:lnNumType w:countBy="1" w:restart="continuous" w:distance="130"/>
+          <w:cols w:num="2" w:space="340" w:equalWidth="1"/>
+          <w:docGrid w:linePitch="360"/>
+        </w:sectPr>
+      </w:pPr>
     </w:p>
     <w:p>
       <w:pPr>
@@ -7595,33 +7595,6 @@
     </w:p>
     <w:p>
       <w:pPr>
-        <w:spacing w:before="0" w:after="0" w:line="440" w:lineRule="exact"/>
-        <w:rPr>
-          <w:sz w:val="2"/>
-          <w:szCs w:val="2"/>
-        </w:rPr>
-      </w:pPr>
-    </w:p>
-    <w:p>
-      <w:pPr>
-        <w:spacing w:before="0" w:after="0" w:line="20" w:lineRule="exact"/>
-        <w:rPr>
-          <w:sz w:val="2"/>
-          <w:szCs w:val="2"/>
-        </w:rPr>
-        <w:sectPr>
-          <w:headerReference w:type="default" r:id="rId17"/>
-          <w:type w:val="continuous"/>
-          <w:pgSz w:h="16838" w:w="11906"/>
-          <w:pgMar w:bottom="1417" w:footer="720" w:gutter="0" w:header="720" w:left="1417" w:right="1417" w:top="1417"/>
-          <w:lnNumType w:countBy="1" w:restart="continuous" w:distance="130"/>
-          <w:cols w:num="2" w:space="340" w:equalWidth="1"/>
-          <w:docGrid w:linePitch="360"/>
-        </w:sectPr>
-      </w:pPr>
-    </w:p>
-    <w:p>
-      <w:pPr>
         <w:pStyle w:val="BodyText"/>
         <w:jc w:val="center"/>
         <w:keepNext/>
@@ -7631,7 +7604,7 @@
       <w:r>
         <w:drawing>
           <wp:inline>
-            <wp:extent cx="2778369" cy="1828799"/>
+            <wp:extent cx="2766974" cy="1821299"/>
             <wp:effectExtent b="0" l="0" r="0" t="0"/>
             <wp:docPr descr="ICC(3,k) versus number of judges, peaking at the selected strong panel" title="" id="26" name="Picture"/>
             <a:graphic>
@@ -7652,7 +7625,7 @@
                   <pic:spPr bwMode="auto">
                     <a:xfrm>
                       <a:off x="0" y="0"/>
-                      <a:ext cx="2778369" cy="1828799"/>
+                      <a:ext cx="2766974" cy="1821299"/>
                     </a:xfrm>
                     <a:prstGeom prst="rect">
                       <a:avLst/>
@@ -7704,33 +7677,6 @@
     </w:p>
     <w:p>
       <w:pPr>
-        <w:spacing w:before="0" w:after="0" w:line="440" w:lineRule="exact"/>
-        <w:rPr>
-          <w:sz w:val="2"/>
-          <w:szCs w:val="2"/>
-        </w:rPr>
-      </w:pPr>
-    </w:p>
-    <w:p>
-      <w:pPr>
-        <w:spacing w:before="0" w:after="0" w:line="20" w:lineRule="exact"/>
-        <w:rPr>
-          <w:sz w:val="2"/>
-          <w:szCs w:val="2"/>
-        </w:rPr>
-        <w:sectPr>
-          <w:headerReference w:type="default" r:id="rId18"/>
-          <w:type w:val="continuous"/>
-          <w:pgSz w:h="16838" w:w="11906"/>
-          <w:pgMar w:bottom="1417" w:footer="720" w:gutter="0" w:header="720" w:left="1417" w:right="1417" w:top="1417"/>
-          <w:lnNumType w:countBy="1" w:restart="continuous" w:distance="130"/>
-          <w:cols w:num="1" w:space="340"/>
-          <w:docGrid w:linePitch="360"/>
-        </w:sectPr>
-      </w:pPr>
-    </w:p>
-    <w:p>
-      <w:pPr>
         <w:pStyle w:val="BodyText"/>
         <w:jc w:val="both"/>
         <w:keepNext w:val="0"/>
@@ -8704,7 +8650,7 @@
           <w:szCs w:val="2"/>
         </w:rPr>
         <w:sectPr>
-          <w:headerReference w:type="default" r:id="rId19"/>
+          <w:headerReference w:type="default" r:id="rId17"/>
           <w:type w:val="continuous"/>
           <w:pgSz w:h="16838" w:w="11906"/>
           <w:pgMar w:bottom="1417" w:footer="720" w:gutter="0" w:header="720" w:left="1417" w:right="1417" w:top="1417"/>
@@ -9568,7 +9514,7 @@
           <w:szCs w:val="2"/>
         </w:rPr>
         <w:sectPr>
-          <w:headerReference w:type="default" r:id="rId20"/>
+          <w:headerReference w:type="default" r:id="rId18"/>
           <w:type w:val="continuous"/>
           <w:pgSz w:h="16838" w:w="11906"/>
           <w:pgMar w:bottom="1417" w:footer="720" w:gutter="0" w:header="720" w:left="1417" w:right="1417" w:top="1417"/>
@@ -14609,7 +14555,7 @@
           <w:szCs w:val="2"/>
         </w:rPr>
         <w:sectPr>
-          <w:headerReference w:type="default" r:id="rId22"/>
+          <w:headerReference w:type="default" r:id="rId19"/>
           <w:type w:val="continuous"/>
           <w:pgSz w:h="16838" w:w="11906"/>
           <w:pgMar w:bottom="1417" w:footer="720" w:gutter="0" w:header="720" w:left="1417" w:right="1417" w:top="1417"/>
@@ -15111,7 +15057,7 @@
           <w:szCs w:val="2"/>
         </w:rPr>
         <w:sectPr>
-          <w:headerReference w:type="default" r:id="rId23"/>
+          <w:headerReference w:type="default" r:id="rId20"/>
           <w:type w:val="continuous"/>
           <w:pgSz w:h="16838" w:w="11906"/>
           <w:pgMar w:bottom="1417" w:footer="720" w:gutter="0" w:header="720" w:left="1417" w:right="1417" w:top="1417"/>
@@ -16007,7 +15953,7 @@
           <w:szCs w:val="2"/>
         </w:rPr>
         <w:sectPr>
-          <w:headerReference w:type="default" r:id="rId24"/>
+          <w:headerReference w:type="default" r:id="rId22"/>
           <w:type w:val="continuous"/>
           <w:pgSz w:h="16838" w:w="11906"/>
           <w:pgMar w:bottom="1417" w:footer="720" w:gutter="0" w:header="720" w:left="1417" w:right="1417" w:top="1417"/>
@@ -17302,7 +17248,7 @@
           <w:szCs w:val="2"/>
         </w:rPr>
         <w:sectPr>
-          <w:headerReference w:type="default" r:id="rId26"/>
+          <w:headerReference w:type="default" r:id="rId23"/>
           <w:type w:val="continuous"/>
           <w:pgSz w:h="16838" w:w="11906"/>
           <w:pgMar w:bottom="1417" w:footer="720" w:gutter="0" w:header="720" w:left="1417" w:right="1417" w:top="1417"/>
@@ -17616,7 +17562,7 @@
           <w:szCs w:val="2"/>
         </w:rPr>
         <w:sectPr>
-          <w:headerReference w:type="default" r:id="rId27"/>
+          <w:headerReference w:type="default" r:id="rId24"/>
           <w:type w:val="continuous"/>
           <w:pgSz w:h="16838" w:w="11906"/>
           <w:pgMar w:bottom="1417" w:footer="720" w:gutter="0" w:header="720" w:left="1417" w:right="1417" w:top="1417"/>
@@ -18180,7 +18126,7 @@
           <w:szCs w:val="2"/>
         </w:rPr>
         <w:sectPr>
-          <w:headerReference w:type="default" r:id="rId28"/>
+          <w:headerReference w:type="default" r:id="rId26"/>
           <w:type w:val="continuous"/>
           <w:pgSz w:h="16838" w:w="11906"/>
           <w:pgMar w:bottom="1417" w:footer="720" w:gutter="0" w:header="720" w:left="1417" w:right="1417" w:top="1417"/>
@@ -18496,7 +18442,7 @@
           <w:szCs w:val="2"/>
         </w:rPr>
         <w:sectPr>
-          <w:headerReference w:type="default" r:id="rId29"/>
+          <w:headerReference w:type="default" r:id="rId27"/>
           <w:type w:val="continuous"/>
           <w:pgSz w:h="16838" w:w="11906"/>
           <w:pgMar w:bottom="1417" w:footer="720" w:gutter="0" w:header="720" w:left="1417" w:right="1417" w:top="1417"/>
@@ -19355,7 +19301,7 @@
           <w:szCs w:val="2"/>
         </w:rPr>
         <w:sectPr>
-          <w:headerReference w:type="default" r:id="rId30"/>
+          <w:headerReference w:type="default" r:id="rId28"/>
           <w:type w:val="continuous"/>
           <w:pgSz w:h="16838" w:w="11906"/>
           <w:pgMar w:bottom="1417" w:footer="720" w:gutter="0" w:header="720" w:left="1417" w:right="1417" w:top="1417"/>
@@ -19945,7 +19891,7 @@
           <w:szCs w:val="2"/>
         </w:rPr>
         <w:sectPr>
-          <w:headerReference w:type="default" r:id="rId31"/>
+          <w:headerReference w:type="default" r:id="rId29"/>
           <w:type w:val="continuous"/>
           <w:pgSz w:h="16838" w:w="11906"/>
           <w:pgMar w:bottom="1417" w:footer="720" w:gutter="0" w:header="720" w:left="1417" w:right="1417" w:top="1417"/>
@@ -20844,7 +20790,7 @@
     </w:tbl>
     <w:bookmarkEnd w:id="126"/>
     <w:sectPr>
-      <w:headerReference w:type="default" r:id="rId32"/>
+      <w:headerReference w:type="default" r:id="rId30"/>
       <w:type w:val="continuous"/>
       <w:pgSz w:h="16838" w:w="11906"/>
       <w:pgMar w:bottom="1417" w:footer="720" w:gutter="0" w:header="720" w:left="1417" w:right="1417" w:top="1417"/>
@@ -21111,44 +21057,6 @@
 </file>
 
 <file path=word/header2.xml><?xml version="1.0" encoding="utf-8"?>
-<w:hdr xmlns:m="http://schemas.openxmlformats.org/officeDocument/2006/math" xmlns:mc="http://schemas.openxmlformats.org/markup-compatibility/2006" xmlns:mo="http://schemas.microsoft.com/office/mac/office/2008/main" xmlns:mv="urn:schemas-microsoft-com:mac:vml" xmlns:o="urn:schemas-microsoft-com:office:office" xmlns:r="http://schemas.openxmlformats.org/officeDocument/2006/relationships" xmlns:v="urn:schemas-microsoft-com:vml" xmlns:w10="urn:schemas-microsoft-com:office:word" xmlns:w14="http://schemas.microsoft.com/office/word/2010/wordml" xmlns:w="http://schemas.openxmlformats.org/wordprocessingml/2006/main" xmlns:wne="http://schemas.microsoft.com/office/word/2006/wordml" xmlns:wp14="http://schemas.microsoft.com/office/word/2010/wordprocessingDrawing" xmlns:wp="http://schemas.openxmlformats.org/drawingml/2006/wordprocessingDrawing" xmlns:wpc="http://schemas.microsoft.com/office/word/2010/wordprocessingCanvas" xmlns:wpg="http://schemas.microsoft.com/office/word/2010/wordprocessingGroup" xmlns:wpi="http://schemas.microsoft.com/office/word/2010/wordprocessingInk" xmlns:wps="http://schemas.microsoft.com/office/word/2010/wordprocessingShape" mc:Ignorable="w14 wp14">
-  <w:p>
-    <w:pPr>
-      <w:pStyle w:val="Header"/>
-      <w:jc w:val="center"/>
-    </w:pPr>
-    <w:r>
-      <w:rPr>
-        <w:rFonts w:ascii="Times New Roman" w:hAnsi="Times New Roman"/>
-        <w:i/>
-        <w:sz w:val="18"/>
-      </w:rPr>
-      <w:t>Confidential TACL submission. DO NOT DISTRIBUTE.</w:t>
-    </w:r>
-  </w:p>
-</w:hdr>
-</file>
-
-<file path=word/header20.xml><?xml version="1.0" encoding="utf-8"?>
-<w:hdr xmlns:m="http://schemas.openxmlformats.org/officeDocument/2006/math" xmlns:mc="http://schemas.openxmlformats.org/markup-compatibility/2006" xmlns:mo="http://schemas.microsoft.com/office/mac/office/2008/main" xmlns:mv="urn:schemas-microsoft-com:mac:vml" xmlns:o="urn:schemas-microsoft-com:office:office" xmlns:r="http://schemas.openxmlformats.org/officeDocument/2006/relationships" xmlns:v="urn:schemas-microsoft-com:vml" xmlns:w10="urn:schemas-microsoft-com:office:word" xmlns:w14="http://schemas.microsoft.com/office/word/2010/wordml" xmlns:w="http://schemas.openxmlformats.org/wordprocessingml/2006/main" xmlns:wne="http://schemas.microsoft.com/office/word/2006/wordml" xmlns:wp14="http://schemas.microsoft.com/office/word/2010/wordprocessingDrawing" xmlns:wp="http://schemas.openxmlformats.org/drawingml/2006/wordprocessingDrawing" xmlns:wpc="http://schemas.microsoft.com/office/word/2010/wordprocessingCanvas" xmlns:wpg="http://schemas.microsoft.com/office/word/2010/wordprocessingGroup" xmlns:wpi="http://schemas.microsoft.com/office/word/2010/wordprocessingInk" xmlns:wps="http://schemas.microsoft.com/office/word/2010/wordprocessingShape" mc:Ignorable="w14 wp14">
-  <w:p>
-    <w:pPr>
-      <w:pStyle w:val="Header"/>
-      <w:jc w:val="center"/>
-    </w:pPr>
-    <w:r>
-      <w:rPr>
-        <w:rFonts w:ascii="Times New Roman" w:hAnsi="Times New Roman"/>
-        <w:i/>
-        <w:sz w:val="18"/>
-      </w:rPr>
-      <w:t>Confidential TACL submission. DO NOT DISTRIBUTE.</w:t>
-    </w:r>
-  </w:p>
-</w:hdr>
-</file>
-
-<file path=word/header21.xml><?xml version="1.0" encoding="utf-8"?>
 <w:hdr xmlns:m="http://schemas.openxmlformats.org/officeDocument/2006/math" xmlns:mc="http://schemas.openxmlformats.org/markup-compatibility/2006" xmlns:mo="http://schemas.microsoft.com/office/mac/office/2008/main" xmlns:mv="urn:schemas-microsoft-com:mac:vml" xmlns:o="urn:schemas-microsoft-com:office:office" xmlns:r="http://schemas.openxmlformats.org/officeDocument/2006/relationships" xmlns:v="urn:schemas-microsoft-com:vml" xmlns:w10="urn:schemas-microsoft-com:office:word" xmlns:w14="http://schemas.microsoft.com/office/word/2010/wordml" xmlns:w="http://schemas.openxmlformats.org/wordprocessingml/2006/main" xmlns:wne="http://schemas.microsoft.com/office/word/2006/wordml" xmlns:wp14="http://schemas.microsoft.com/office/word/2010/wordprocessingDrawing" xmlns:wp="http://schemas.openxmlformats.org/drawingml/2006/wordprocessingDrawing" xmlns:wpc="http://schemas.microsoft.com/office/word/2010/wordprocessingCanvas" xmlns:wpg="http://schemas.microsoft.com/office/word/2010/wordprocessingGroup" xmlns:wpi="http://schemas.microsoft.com/office/word/2010/wordprocessingInk" xmlns:wps="http://schemas.microsoft.com/office/word/2010/wordprocessingShape" mc:Ignorable="w14 wp14">
   <w:p>
     <w:pPr>

</xml_diff>

<commit_message>
TACL: properly fix two-column line numbers (real LineNumber styleId, 7pt, distance 80)
Root cause of the persistent right-column overlap: the line numbers were still ~11pt because
python-docx's add_style('Line Number') created a PHANTOM style; Word formats line numbers via
the built-in character style with styleId 'LineNumber', which that never touched. Fix: inject
the real styleId='LineNumber' style via OXML at 7pt (sz=14 half-points), and reduce the
line-number distance 130->80 twips so the right-column numbers sit just left of the right
column with a clean gap from the left column. Render-verified: small, legible, no text overlap,
both columns numbered. Still 10 content pages.
</commit_message>
<xml_diff>
--- a/docs/paper/CoEval_TACL.docx
+++ b/docs/paper/CoEval_TACL.docx
@@ -368,7 +368,7 @@
           <w:type w:val="continuous"/>
           <w:pgSz w:h="16838" w:w="11906"/>
           <w:pgMar w:bottom="1417" w:footer="720" w:gutter="0" w:header="720" w:left="1417" w:right="1417" w:top="1417"/>
-          <w:lnNumType w:countBy="1" w:restart="continuous" w:distance="130"/>
+          <w:lnNumType w:countBy="1" w:restart="continuous" w:distance="80"/>
           <w:cols w:num="1" w:space="340"/>
           <w:docGrid w:linePitch="360"/>
         </w:sectPr>
@@ -4166,7 +4166,7 @@
           <w:type w:val="continuous"/>
           <w:pgSz w:h="16838" w:w="11906"/>
           <w:pgMar w:bottom="1417" w:footer="720" w:gutter="0" w:header="720" w:left="1417" w:right="1417" w:top="1417"/>
-          <w:lnNumType w:countBy="1" w:restart="continuous" w:distance="130"/>
+          <w:lnNumType w:countBy="1" w:restart="continuous" w:distance="80"/>
           <w:cols w:num="2" w:space="340" w:equalWidth="1"/>
           <w:docGrid w:linePitch="360"/>
         </w:sectPr>
@@ -4845,7 +4845,7 @@
           <w:type w:val="continuous"/>
           <w:pgSz w:h="16838" w:w="11906"/>
           <w:pgMar w:bottom="1417" w:footer="720" w:gutter="0" w:header="720" w:left="1417" w:right="1417" w:top="1417"/>
-          <w:lnNumType w:countBy="1" w:restart="continuous" w:distance="130"/>
+          <w:lnNumType w:countBy="1" w:restart="continuous" w:distance="80"/>
           <w:cols w:num="1" w:space="340"/>
           <w:docGrid w:linePitch="360"/>
         </w:sectPr>
@@ -5433,7 +5433,7 @@
           <w:type w:val="continuous"/>
           <w:pgSz w:h="16838" w:w="11906"/>
           <w:pgMar w:bottom="1417" w:footer="720" w:gutter="0" w:header="720" w:left="1417" w:right="1417" w:top="1417"/>
-          <w:lnNumType w:countBy="1" w:restart="continuous" w:distance="130"/>
+          <w:lnNumType w:countBy="1" w:restart="continuous" w:distance="80"/>
           <w:cols w:num="2" w:space="340" w:equalWidth="1"/>
           <w:docGrid w:linePitch="360"/>
         </w:sectPr>
@@ -5867,7 +5867,7 @@
           <w:type w:val="continuous"/>
           <w:pgSz w:h="16838" w:w="11906"/>
           <w:pgMar w:bottom="1417" w:footer="720" w:gutter="0" w:header="720" w:left="1417" w:right="1417" w:top="1417"/>
-          <w:lnNumType w:countBy="1" w:restart="continuous" w:distance="130"/>
+          <w:lnNumType w:countBy="1" w:restart="continuous" w:distance="80"/>
           <w:cols w:num="1" w:space="340"/>
           <w:docGrid w:linePitch="360"/>
         </w:sectPr>
@@ -6257,7 +6257,7 @@
           <w:type w:val="continuous"/>
           <w:pgSz w:h="16838" w:w="11906"/>
           <w:pgMar w:bottom="1417" w:footer="720" w:gutter="0" w:header="720" w:left="1417" w:right="1417" w:top="1417"/>
-          <w:lnNumType w:countBy="1" w:restart="continuous" w:distance="130"/>
+          <w:lnNumType w:countBy="1" w:restart="continuous" w:distance="80"/>
           <w:cols w:num="2" w:space="340" w:equalWidth="1"/>
           <w:docGrid w:linePitch="360"/>
         </w:sectPr>
@@ -7003,7 +7003,7 @@
           <w:type w:val="continuous"/>
           <w:pgSz w:h="16838" w:w="11906"/>
           <w:pgMar w:bottom="1417" w:footer="720" w:gutter="0" w:header="720" w:left="1417" w:right="1417" w:top="1417"/>
-          <w:lnNumType w:countBy="1" w:restart="continuous" w:distance="130"/>
+          <w:lnNumType w:countBy="1" w:restart="continuous" w:distance="80"/>
           <w:cols w:num="1" w:space="340"/>
           <w:docGrid w:linePitch="360"/>
         </w:sectPr>
@@ -8654,7 +8654,7 @@
           <w:type w:val="continuous"/>
           <w:pgSz w:h="16838" w:w="11906"/>
           <w:pgMar w:bottom="1417" w:footer="720" w:gutter="0" w:header="720" w:left="1417" w:right="1417" w:top="1417"/>
-          <w:lnNumType w:countBy="1" w:restart="continuous" w:distance="130"/>
+          <w:lnNumType w:countBy="1" w:restart="continuous" w:distance="80"/>
           <w:cols w:num="2" w:space="340" w:equalWidth="1"/>
           <w:docGrid w:linePitch="360"/>
         </w:sectPr>
@@ -9518,7 +9518,7 @@
           <w:type w:val="continuous"/>
           <w:pgSz w:h="16838" w:w="11906"/>
           <w:pgMar w:bottom="1417" w:footer="720" w:gutter="0" w:header="720" w:left="1417" w:right="1417" w:top="1417"/>
-          <w:lnNumType w:countBy="1" w:restart="continuous" w:distance="130"/>
+          <w:lnNumType w:countBy="1" w:restart="continuous" w:distance="80"/>
           <w:cols w:num="1" w:space="340"/>
           <w:docGrid w:linePitch="360"/>
         </w:sectPr>
@@ -14559,7 +14559,7 @@
           <w:type w:val="continuous"/>
           <w:pgSz w:h="16838" w:w="11906"/>
           <w:pgMar w:bottom="1417" w:footer="720" w:gutter="0" w:header="720" w:left="1417" w:right="1417" w:top="1417"/>
-          <w:lnNumType w:countBy="1" w:restart="continuous" w:distance="130"/>
+          <w:lnNumType w:countBy="1" w:restart="continuous" w:distance="80"/>
           <w:cols w:num="2" w:space="340" w:equalWidth="1"/>
           <w:docGrid w:linePitch="360"/>
         </w:sectPr>
@@ -15061,7 +15061,7 @@
           <w:type w:val="continuous"/>
           <w:pgSz w:h="16838" w:w="11906"/>
           <w:pgMar w:bottom="1417" w:footer="720" w:gutter="0" w:header="720" w:left="1417" w:right="1417" w:top="1417"/>
-          <w:lnNumType w:countBy="1" w:restart="continuous" w:distance="130"/>
+          <w:lnNumType w:countBy="1" w:restart="continuous" w:distance="80"/>
           <w:cols w:num="1" w:space="340"/>
           <w:docGrid w:linePitch="360"/>
         </w:sectPr>
@@ -15957,7 +15957,7 @@
           <w:type w:val="continuous"/>
           <w:pgSz w:h="16838" w:w="11906"/>
           <w:pgMar w:bottom="1417" w:footer="720" w:gutter="0" w:header="720" w:left="1417" w:right="1417" w:top="1417"/>
-          <w:lnNumType w:countBy="1" w:restart="continuous" w:distance="130"/>
+          <w:lnNumType w:countBy="1" w:restart="continuous" w:distance="80"/>
           <w:cols w:num="2" w:space="340" w:equalWidth="1"/>
           <w:docGrid w:linePitch="360"/>
         </w:sectPr>
@@ -17252,7 +17252,7 @@
           <w:type w:val="continuous"/>
           <w:pgSz w:h="16838" w:w="11906"/>
           <w:pgMar w:bottom="1417" w:footer="720" w:gutter="0" w:header="720" w:left="1417" w:right="1417" w:top="1417"/>
-          <w:lnNumType w:countBy="1" w:restart="continuous" w:distance="130"/>
+          <w:lnNumType w:countBy="1" w:restart="continuous" w:distance="80"/>
           <w:cols w:num="1" w:space="340"/>
           <w:docGrid w:linePitch="360"/>
         </w:sectPr>
@@ -17566,7 +17566,7 @@
           <w:type w:val="continuous"/>
           <w:pgSz w:h="16838" w:w="11906"/>
           <w:pgMar w:bottom="1417" w:footer="720" w:gutter="0" w:header="720" w:left="1417" w:right="1417" w:top="1417"/>
-          <w:lnNumType w:countBy="1" w:restart="continuous" w:distance="130"/>
+          <w:lnNumType w:countBy="1" w:restart="continuous" w:distance="80"/>
           <w:cols w:num="2" w:space="340" w:equalWidth="1"/>
           <w:docGrid w:linePitch="360"/>
         </w:sectPr>
@@ -18130,7 +18130,7 @@
           <w:type w:val="continuous"/>
           <w:pgSz w:h="16838" w:w="11906"/>
           <w:pgMar w:bottom="1417" w:footer="720" w:gutter="0" w:header="720" w:left="1417" w:right="1417" w:top="1417"/>
-          <w:lnNumType w:countBy="1" w:restart="continuous" w:distance="130"/>
+          <w:lnNumType w:countBy="1" w:restart="continuous" w:distance="80"/>
           <w:cols w:num="1" w:space="340"/>
           <w:docGrid w:linePitch="360"/>
         </w:sectPr>
@@ -18446,7 +18446,7 @@
           <w:type w:val="continuous"/>
           <w:pgSz w:h="16838" w:w="11906"/>
           <w:pgMar w:bottom="1417" w:footer="720" w:gutter="0" w:header="720" w:left="1417" w:right="1417" w:top="1417"/>
-          <w:lnNumType w:countBy="1" w:restart="continuous" w:distance="130"/>
+          <w:lnNumType w:countBy="1" w:restart="continuous" w:distance="80"/>
           <w:cols w:num="2" w:space="340" w:equalWidth="1"/>
           <w:docGrid w:linePitch="360"/>
         </w:sectPr>
@@ -19305,7 +19305,7 @@
           <w:type w:val="continuous"/>
           <w:pgSz w:h="16838" w:w="11906"/>
           <w:pgMar w:bottom="1417" w:footer="720" w:gutter="0" w:header="720" w:left="1417" w:right="1417" w:top="1417"/>
-          <w:lnNumType w:countBy="1" w:restart="continuous" w:distance="130"/>
+          <w:lnNumType w:countBy="1" w:restart="continuous" w:distance="80"/>
           <w:cols w:num="1" w:space="340"/>
           <w:docGrid w:linePitch="360"/>
         </w:sectPr>
@@ -19895,7 +19895,7 @@
           <w:type w:val="continuous"/>
           <w:pgSz w:h="16838" w:w="11906"/>
           <w:pgMar w:bottom="1417" w:footer="720" w:gutter="0" w:header="720" w:left="1417" w:right="1417" w:top="1417"/>
-          <w:lnNumType w:countBy="1" w:restart="continuous" w:distance="130"/>
+          <w:lnNumType w:countBy="1" w:restart="continuous" w:distance="80"/>
           <w:cols w:num="2" w:space="340" w:equalWidth="1"/>
           <w:docGrid w:linePitch="360"/>
         </w:sectPr>
@@ -20794,7 +20794,7 @@
       <w:type w:val="continuous"/>
       <w:pgSz w:h="16838" w:w="11906"/>
       <w:pgMar w:bottom="1417" w:footer="720" w:gutter="0" w:header="720" w:left="1417" w:right="1417" w:top="1417"/>
-      <w:lnNumType w:countBy="1" w:restart="continuous" w:distance="130"/>
+      <w:lnNumType w:countBy="1" w:restart="continuous" w:distance="80"/>
       <w:cols w:num="1" w:space="340"/>
       <w:docGrid w:linePitch="360"/>
     </w:sectPr>
@@ -33946,11 +33946,12 @@
     <w:basedOn w:val="VerbatimChar"/>
     <w:rPr/>
   </w:style>
-  <w:style w:type="character" w:customStyle="1" w:styleId="LineNumber">
+  <w:style w:type="character" w:styleId="LineNumber">
     <w:name w:val="Line Number"/>
     <w:rPr>
       <w:rFonts w:ascii="Times New Roman" w:hAnsi="Times New Roman"/>
-      <w:sz w:val="16"/>
+      <w:sz w:val="14"/>
+      <w:szCs w:val="14"/>
     </w:rPr>
   </w:style>
 </w:styles>

</xml_diff>